<commit_message>
Complete all-chapter revision and synchronize book editions and reading keys
Co-authored-by: arena-agent <297053741+arena-agent@users.noreply.github.com>
</commit_message>
<xml_diff>
--- a/Master-Speaking-Class-Companion.docx
+++ b/Master-Speaking-Class-Companion.docx
@@ -1665,7 +1665,7 @@
       <w:rFonts w:asciiTheme="majorHAnsi" w:eastAsiaTheme="majorEastAsia" w:hAnsiTheme="majorHAnsi" w:cstheme="majorBidi" w:ascii="Source Sans 3" w:hAnsi="Source Sans 3"/>
       <w:b/>
       <w:bCs/>
-      <w:color w:val="0E6E5C"/>
+      <w:color w:val="205F67"/>
       <w:sz w:val="28"/>
       <w:szCs w:val="28"/>
     </w:rPr>
@@ -1689,7 +1689,7 @@
       <w:rFonts w:asciiTheme="majorHAnsi" w:eastAsiaTheme="majorEastAsia" w:hAnsiTheme="majorHAnsi" w:cstheme="majorBidi" w:ascii="Source Sans 3" w:hAnsi="Source Sans 3"/>
       <w:b/>
       <w:bCs/>
-      <w:color w:val="0E6E5C"/>
+      <w:color w:val="205F67"/>
       <w:sz w:val="26"/>
       <w:szCs w:val="26"/>
     </w:rPr>
@@ -1952,7 +1952,7 @@
     </w:pPr>
     <w:rPr>
       <w:rFonts w:asciiTheme="majorHAnsi" w:eastAsiaTheme="majorEastAsia" w:hAnsiTheme="majorHAnsi" w:cstheme="majorBidi" w:ascii="Source Sans 3" w:hAnsi="Source Sans 3"/>
-      <w:color w:val="0E6E5C"/>
+      <w:color w:val="205F67"/>
       <w:spacing w:val="5"/>
       <w:kern w:val="28"/>
       <w:sz w:val="52"/>

</xml_diff>

<commit_message>
Finalize self-contained print and digital course with original graphics and listening lessons
Co-authored-by: arena-agent <297053741+arena-agent@users.noreply.github.com>
</commit_message>
<xml_diff>
--- a/Master-Speaking-Class-Companion.docx
+++ b/Master-Speaking-Class-Companion.docx
@@ -25,7 +25,7 @@
     </w:p>
     <w:p>
       <w:r>
-        <w:t>Companion to the eight units of Master Speaking by Abdul Raziq Nazari. These newly authored activities are not passages, transcripts, or answer keys from the original manuscript. The original book and its production files remain unchanged.</w:t>
+        <w:t>Companion to the eight units of Master Speaking by Abdul Raziq Nazari. These newly authored activities are not passages, transcripts, or answer keys from the original manuscript. Use this companion with the self-contained course and its original read-aloud listening stories.</w:t>
       </w:r>
     </w:p>
     <w:p>
@@ -63,7 +63,7 @@
     </w:p>
     <w:p>
       <w:r>
-        <w:t>Teacher preparation: choose a short reading or listening section from the matching unit. Check its suitability and accessibility before class. The companion tasks work without the original videos: use the short fictional scenarios supplied here instead. Do not present these scenarios as video transcripts or research findings.</w:t>
+        <w:t>Teacher preparation: choose a short reading or listening section from the matching unit. Check its suitability and accessibility before class. Use the original story in the matching listening chapter, or the short fictional scenario supplied here for speaking practice. These scenarios are teaching examples, not research findings.</w:t>
       </w:r>
     </w:p>
     <w:p>
@@ -1200,7 +1200,7 @@
     </w:p>
     <w:p>
       <w:r>
-        <w:t>When no video or internet is available: use the unit’s fictional scenario and the information-exchange task. This provides speaking practice but does not replace assessment of listening to an authentic recording. Never mark the original listening exercise as completed without its input.</w:t>
+        <w:t>No internet or video is required: read the matching course story aloud for listening, or use the unit’s fictional scenario for speaking practice. A silent reading task is not evidence of listening performance; record the actual task and support used.</w:t>
       </w:r>
     </w:p>
     <w:p>

</xml_diff>